<commit_message>
Added edited notebooks with brand names anonymized
</commit_message>
<xml_diff>
--- a/Juan Delgado_Final Project IST 691.docx
+++ b/Juan Delgado_Final Project IST 691.docx
@@ -1793,23 +1793,7 @@
           <w:sz w:val="22"/>
           <w:szCs w:val="22"/>
         </w:rPr>
-        <w:t xml:space="preserve">for the use of </w:t>
-      </w:r>
-      <w:proofErr w:type="spellStart"/>
-      <w:r>
-        <w:rPr>
-          <w:sz w:val="22"/>
-          <w:szCs w:val="22"/>
-        </w:rPr>
-        <w:t>MobileNet</w:t>
-      </w:r>
-      <w:proofErr w:type="spellEnd"/>
-      <w:r>
-        <w:rPr>
-          <w:sz w:val="22"/>
-          <w:szCs w:val="22"/>
-        </w:rPr>
-        <w:t xml:space="preserve"> and VGG</w:t>
+        <w:t>for the use of MobileNet and VGG</w:t>
       </w:r>
       <w:r>
         <w:rPr>
@@ -3689,23 +3673,7 @@
           <w:sz w:val="22"/>
           <w:szCs w:val="22"/>
         </w:rPr>
-        <w:t xml:space="preserve">. In other words, </w:t>
-      </w:r>
-      <w:proofErr w:type="gramStart"/>
-      <w:r>
-        <w:rPr>
-          <w:sz w:val="22"/>
-          <w:szCs w:val="22"/>
-        </w:rPr>
-        <w:t>as a result of</w:t>
-      </w:r>
-      <w:proofErr w:type="gramEnd"/>
-      <w:r>
-        <w:rPr>
-          <w:sz w:val="22"/>
-          <w:szCs w:val="22"/>
-        </w:rPr>
-        <w:t xml:space="preserve"> the convolutional and pooling layers, the spatial size o</w:t>
+        <w:t>. In other words, as a result of the convolutional and pooling layers, the spatial size o</w:t>
       </w:r>
       <w:r>
         <w:rPr>
@@ -3721,21 +3689,12 @@
         </w:rPr>
         <w:t xml:space="preserve">the volume will increase due to the increased number of filters.  This is all while using </w:t>
       </w:r>
-      <w:proofErr w:type="spellStart"/>
-      <w:r>
-        <w:rPr>
-          <w:sz w:val="22"/>
-          <w:szCs w:val="22"/>
-        </w:rPr>
-        <w:t>ReLU</w:t>
-      </w:r>
-      <w:proofErr w:type="spellEnd"/>
-      <w:r>
-        <w:rPr>
-          <w:sz w:val="22"/>
-          <w:szCs w:val="22"/>
-        </w:rPr>
-        <w:t xml:space="preserve"> for non-linearity activation function and is trained using stochastic gradient descent, [1]. While VGG is already a robust algorithm there are inherent issues with </w:t>
+      <w:r>
+        <w:rPr>
+          <w:sz w:val="22"/>
+          <w:szCs w:val="22"/>
+        </w:rPr>
+        <w:t xml:space="preserve">ReLU for non-linearity activation function and is trained using stochastic gradient descent, [1]. While VGG is already a robust algorithm there are inherent issues with </w:t>
       </w:r>
       <w:r>
         <w:rPr>
@@ -4096,17 +4055,71 @@
           <w:sz w:val="22"/>
           <w:szCs w:val="22"/>
         </w:rPr>
+        <w:t xml:space="preserve">the ReLU </w:t>
+      </w:r>
+      <w:r>
+        <w:rPr>
+          <w:sz w:val="22"/>
+          <w:szCs w:val="22"/>
+        </w:rPr>
+        <w:t>activation function at each layer</w:t>
+      </w:r>
+      <w:r>
+        <w:rPr>
+          <w:sz w:val="22"/>
+          <w:szCs w:val="22"/>
+        </w:rPr>
+        <w:t>.</w:t>
+      </w:r>
+      <w:r>
+        <w:rPr>
+          <w:sz w:val="22"/>
+          <w:szCs w:val="22"/>
+        </w:rPr>
+        <w:t xml:space="preserve">  During the flattening layer we used the Softmax activation function.</w:t>
+      </w:r>
+      <w:r>
+        <w:rPr>
+          <w:sz w:val="22"/>
+          <w:szCs w:val="22"/>
+        </w:rPr>
+        <w:t xml:space="preserve"> </w:t>
+      </w:r>
+      <w:r>
+        <w:rPr>
+          <w:sz w:val="22"/>
+          <w:szCs w:val="22"/>
+        </w:rPr>
+        <w:t xml:space="preserve">Then for the model we </w:t>
+      </w:r>
+      <w:r>
+        <w:rPr>
+          <w:sz w:val="22"/>
+          <w:szCs w:val="22"/>
+        </w:rPr>
+        <w:t xml:space="preserve">used the </w:t>
+      </w:r>
+      <w:r>
+        <w:rPr>
+          <w:sz w:val="22"/>
+          <w:szCs w:val="22"/>
+        </w:rPr>
+        <w:t xml:space="preserve">‘Adam optimizer’ along with </w:t>
+      </w:r>
+      <w:r>
+        <w:rPr>
+          <w:sz w:val="22"/>
+          <w:szCs w:val="22"/>
+        </w:rPr>
         <w:t xml:space="preserve">the </w:t>
       </w:r>
-      <w:proofErr w:type="spellStart"/>
-      <w:r>
-        <w:rPr>
-          <w:sz w:val="22"/>
-          <w:szCs w:val="22"/>
-        </w:rPr>
-        <w:t>ReLU</w:t>
-      </w:r>
-      <w:proofErr w:type="spellEnd"/>
+      <w:r>
+        <w:rPr>
+          <w:sz w:val="22"/>
+          <w:szCs w:val="22"/>
+        </w:rPr>
+        <w:t>‘sparse</w:t>
+      </w:r>
       <w:r>
         <w:rPr>
           <w:sz w:val="22"/>
@@ -4119,37 +4132,7 @@
           <w:sz w:val="22"/>
           <w:szCs w:val="22"/>
         </w:rPr>
-        <w:t>activation function at each layer</w:t>
-      </w:r>
-      <w:r>
-        <w:rPr>
-          <w:sz w:val="22"/>
-          <w:szCs w:val="22"/>
-        </w:rPr>
-        <w:t>.</w:t>
-      </w:r>
-      <w:r>
-        <w:rPr>
-          <w:sz w:val="22"/>
-          <w:szCs w:val="22"/>
-        </w:rPr>
-        <w:t xml:space="preserve">  During the flattening layer we used the </w:t>
-      </w:r>
-      <w:proofErr w:type="spellStart"/>
-      <w:r>
-        <w:rPr>
-          <w:sz w:val="22"/>
-          <w:szCs w:val="22"/>
-        </w:rPr>
-        <w:t>Softmax</w:t>
-      </w:r>
-      <w:proofErr w:type="spellEnd"/>
-      <w:r>
-        <w:rPr>
-          <w:sz w:val="22"/>
-          <w:szCs w:val="22"/>
-        </w:rPr>
-        <w:t xml:space="preserve"> activation function.</w:t>
+        <w:t>categorical</w:t>
       </w:r>
       <w:r>
         <w:rPr>
@@ -4163,72 +4146,7 @@
           <w:sz w:val="22"/>
           <w:szCs w:val="22"/>
         </w:rPr>
-        <w:t xml:space="preserve">Then for the model we </w:t>
-      </w:r>
-      <w:r>
-        <w:rPr>
-          <w:sz w:val="22"/>
-          <w:szCs w:val="22"/>
-        </w:rPr>
-        <w:t xml:space="preserve">used the </w:t>
-      </w:r>
-      <w:r>
-        <w:rPr>
-          <w:sz w:val="22"/>
-          <w:szCs w:val="22"/>
-        </w:rPr>
-        <w:t xml:space="preserve">‘Adam optimizer’ along with </w:t>
-      </w:r>
-      <w:r>
-        <w:rPr>
-          <w:sz w:val="22"/>
-          <w:szCs w:val="22"/>
-        </w:rPr>
-        <w:t xml:space="preserve">the </w:t>
-      </w:r>
-      <w:r>
-        <w:rPr>
-          <w:sz w:val="22"/>
-          <w:szCs w:val="22"/>
-        </w:rPr>
-        <w:t>‘sparse</w:t>
-      </w:r>
-      <w:r>
-        <w:rPr>
-          <w:sz w:val="22"/>
-          <w:szCs w:val="22"/>
-        </w:rPr>
-        <w:t xml:space="preserve"> </w:t>
-      </w:r>
-      <w:r>
-        <w:rPr>
-          <w:sz w:val="22"/>
-          <w:szCs w:val="22"/>
-        </w:rPr>
-        <w:t>categorical</w:t>
-      </w:r>
-      <w:r>
-        <w:rPr>
-          <w:sz w:val="22"/>
-          <w:szCs w:val="22"/>
-        </w:rPr>
-        <w:t xml:space="preserve"> </w:t>
-      </w:r>
-      <w:proofErr w:type="spellStart"/>
-      <w:r>
-        <w:rPr>
-          <w:sz w:val="22"/>
-          <w:szCs w:val="22"/>
-        </w:rPr>
-        <w:t>crossentropy</w:t>
-      </w:r>
-      <w:proofErr w:type="spellEnd"/>
-      <w:r>
-        <w:rPr>
-          <w:sz w:val="22"/>
-          <w:szCs w:val="22"/>
-        </w:rPr>
-        <w:t xml:space="preserve">’ </w:t>
+        <w:t xml:space="preserve">crossentropy’ </w:t>
       </w:r>
       <w:r>
         <w:rPr>
@@ -6683,21 +6601,12 @@
                 <w:szCs w:val="20"/>
               </w:rPr>
             </w:pPr>
-            <w:proofErr w:type="gramStart"/>
             <w:r>
               <w:rPr>
                 <w:sz w:val="20"/>
                 <w:szCs w:val="20"/>
               </w:rPr>
-              <w:t>Overall</w:t>
-            </w:r>
-            <w:proofErr w:type="gramEnd"/>
-            <w:r>
-              <w:rPr>
-                <w:sz w:val="20"/>
-                <w:szCs w:val="20"/>
-              </w:rPr>
-              <w:t xml:space="preserve"> Loss</w:t>
+              <w:t>Overall Loss</w:t>
             </w:r>
           </w:p>
         </w:tc>
@@ -7197,21 +7106,12 @@
                 <w:szCs w:val="20"/>
               </w:rPr>
             </w:pPr>
-            <w:proofErr w:type="gramStart"/>
             <w:r>
               <w:rPr>
                 <w:sz w:val="20"/>
                 <w:szCs w:val="20"/>
               </w:rPr>
-              <w:t>Overall</w:t>
-            </w:r>
-            <w:proofErr w:type="gramEnd"/>
-            <w:r>
-              <w:rPr>
-                <w:sz w:val="20"/>
-                <w:szCs w:val="20"/>
-              </w:rPr>
-              <w:t xml:space="preserve"> Loss</w:t>
+              <w:t>Overall Loss</w:t>
             </w:r>
           </w:p>
         </w:tc>
@@ -7595,23 +7495,7 @@
           <w:sz w:val="22"/>
           <w:szCs w:val="22"/>
         </w:rPr>
-        <w:t xml:space="preserve"> and type of fashion article.  Since eyewear has </w:t>
-      </w:r>
-      <w:proofErr w:type="gramStart"/>
-      <w:r>
-        <w:rPr>
-          <w:sz w:val="22"/>
-          <w:szCs w:val="22"/>
-        </w:rPr>
-        <w:t>a very unique</w:t>
-      </w:r>
-      <w:proofErr w:type="gramEnd"/>
-      <w:r>
-        <w:rPr>
-          <w:sz w:val="22"/>
-          <w:szCs w:val="22"/>
-        </w:rPr>
-        <w:t xml:space="preserve"> shape and </w:t>
+        <w:t xml:space="preserve"> and type of fashion article.  Since eyewear has a very unique shape and </w:t>
       </w:r>
       <w:r>
         <w:rPr>
@@ -8181,53 +8065,12 @@
         </w:rPr>
         <w:t xml:space="preserve">] </w:t>
       </w:r>
-      <w:proofErr w:type="spellStart"/>
       <w:r>
         <w:rPr>
           <w:sz w:val="18"/>
           <w:szCs w:val="18"/>
         </w:rPr>
-        <w:t>Iliukovich-Strakovskaia</w:t>
-      </w:r>
-      <w:proofErr w:type="spellEnd"/>
-      <w:r>
-        <w:rPr>
-          <w:sz w:val="18"/>
-          <w:szCs w:val="18"/>
-        </w:rPr>
-        <w:t xml:space="preserve">, A., Tsvetkova, V., </w:t>
-      </w:r>
-      <w:proofErr w:type="spellStart"/>
-      <w:r>
-        <w:rPr>
-          <w:sz w:val="18"/>
-          <w:szCs w:val="18"/>
-        </w:rPr>
-        <w:t>Dral</w:t>
-      </w:r>
-      <w:proofErr w:type="spellEnd"/>
-      <w:r>
-        <w:rPr>
-          <w:sz w:val="18"/>
-          <w:szCs w:val="18"/>
-        </w:rPr>
-        <w:t xml:space="preserve">, E., &amp; </w:t>
-      </w:r>
-      <w:proofErr w:type="spellStart"/>
-      <w:r>
-        <w:rPr>
-          <w:sz w:val="18"/>
-          <w:szCs w:val="18"/>
-        </w:rPr>
-        <w:t>Dral</w:t>
-      </w:r>
-      <w:proofErr w:type="spellEnd"/>
-      <w:r>
-        <w:rPr>
-          <w:sz w:val="18"/>
-          <w:szCs w:val="18"/>
-        </w:rPr>
-        <w:t>, A. (2018).</w:t>
+        <w:t>Iliukovich-Strakovskaia, A., Tsvetkova, V., Dral, E., &amp; Dral, A. (2018).</w:t>
       </w:r>
       <w:r>
         <w:rPr>
@@ -8264,23 +8107,7 @@
           <w:sz w:val="18"/>
           <w:szCs w:val="18"/>
         </w:rPr>
-        <w:t>In Á. Rocha et al. (Eds.), World Conference on Information Systems and Technologies (</w:t>
-      </w:r>
-      <w:proofErr w:type="spellStart"/>
-      <w:r>
-        <w:rPr>
-          <w:sz w:val="18"/>
-          <w:szCs w:val="18"/>
-        </w:rPr>
-        <w:t>WorldCIST</w:t>
-      </w:r>
-      <w:proofErr w:type="spellEnd"/>
-      <w:r>
-        <w:rPr>
-          <w:sz w:val="18"/>
-          <w:szCs w:val="18"/>
-        </w:rPr>
-        <w:t xml:space="preserve"> 2018) (Advances in Intelligent Systems and Computing, Vol. 747, pp. 41–52). Springer.</w:t>
+        <w:t>In Á. Rocha et al. (Eds.), World Conference on Information Systems and Technologies (WorldCIST 2018) (Advances in Intelligent Systems and Computing, Vol. 747, pp. 41–52). Springer.</w:t>
       </w:r>
     </w:p>
     <w:p>
@@ -8368,53 +8195,21 @@
           <w:sz w:val="18"/>
           <w:szCs w:val="18"/>
         </w:rPr>
-        <w:t xml:space="preserve">M. Sandler, A. Howard, M. Zhu, A. </w:t>
-      </w:r>
-      <w:proofErr w:type="spellStart"/>
+        <w:t>M. Sandler, A. Howard, M. Zhu, A. Zhmoginov, and L.-C. Chen,</w:t>
+      </w:r>
       <w:r>
         <w:rPr>
           <w:sz w:val="18"/>
           <w:szCs w:val="18"/>
         </w:rPr>
-        <w:t>Zhmoginov</w:t>
-      </w:r>
-      <w:proofErr w:type="spellEnd"/>
+        <w:t xml:space="preserve"> </w:t>
+      </w:r>
       <w:r>
         <w:rPr>
           <w:sz w:val="18"/>
           <w:szCs w:val="18"/>
         </w:rPr>
-        <w:t>, and L.-C. Chen,</w:t>
-      </w:r>
-      <w:r>
-        <w:rPr>
-          <w:sz w:val="18"/>
-          <w:szCs w:val="18"/>
-        </w:rPr>
-        <w:t xml:space="preserve"> </w:t>
-      </w:r>
-      <w:r>
-        <w:rPr>
-          <w:sz w:val="18"/>
-          <w:szCs w:val="18"/>
-        </w:rPr>
-        <w:t xml:space="preserve">“MobileNetV2: Inverted residuals and linear </w:t>
-      </w:r>
-      <w:proofErr w:type="spellStart"/>
-      <w:r>
-        <w:rPr>
-          <w:sz w:val="18"/>
-          <w:szCs w:val="18"/>
-        </w:rPr>
-        <w:t>bottlenecks,”in</w:t>
-      </w:r>
-      <w:proofErr w:type="spellEnd"/>
-      <w:r>
-        <w:rPr>
-          <w:sz w:val="18"/>
-          <w:szCs w:val="18"/>
-        </w:rPr>
-        <w:t xml:space="preserve"> </w:t>
+        <w:t xml:space="preserve">“MobileNetV2: Inverted residuals and linear bottlenecks,”in </w:t>
       </w:r>
       <w:r>
         <w:rPr>

</xml_diff>